<commit_message>
update: remove row empty
</commit_message>
<xml_diff>
--- a/public/preview/template.docx
+++ b/public/preview/template.docx
@@ -726,16 +726,22 @@
               </w:rPr>
               <w:t>{</w:t>
             </w:r>
-            <w:proofErr w:type="spellStart"/>
-            <w:r>
-              <w:rPr>
-                <w:rFonts w:cstheme="minorHAnsi"/>
-                <w:b w:val="0"/>
-                <w:bCs w:val="0"/>
-              </w:rPr>
-              <w:t>taxIdLabel</w:t>
-            </w:r>
-            <w:proofErr w:type="spellEnd"/>
+            <w:r>
+              <w:rPr>
+                <w:rFonts w:cstheme="minorHAnsi"/>
+                <w:b w:val="0"/>
+                <w:bCs w:val="0"/>
+              </w:rPr>
+              <w:t>#</w:t>
+            </w:r>
+            <w:r>
+              <w:rPr>
+                <w:rFonts w:cstheme="minorHAnsi"/>
+                <w:b w:val="0"/>
+                <w:bCs w:val="0"/>
+              </w:rPr>
+              <w:t>taxId</w:t>
+            </w:r>
             <w:r>
               <w:rPr>
                 <w:rFonts w:cstheme="minorHAnsi"/>
@@ -743,6 +749,14 @@
                 <w:bCs w:val="0"/>
               </w:rPr>
               <w:t>}</w:t>
+            </w:r>
+            <w:r>
+              <w:rPr>
+                <w:rFonts w:cstheme="minorHAnsi"/>
+                <w:b w:val="0"/>
+                <w:bCs w:val="0"/>
+              </w:rPr>
+              <w:t>TaxId:</w:t>
             </w:r>
           </w:p>
         </w:tc>
@@ -772,6 +786,26 @@
                 <w:rFonts w:cstheme="minorHAnsi"/>
               </w:rPr>
               <w:t>{</w:t>
+            </w:r>
+            <w:proofErr w:type="spellStart"/>
+            <w:r>
+              <w:rPr>
+                <w:rFonts w:cstheme="minorHAnsi"/>
+              </w:rPr>
+              <w:t>taxId</w:t>
+            </w:r>
+            <w:proofErr w:type="spellEnd"/>
+            <w:r>
+              <w:rPr>
+                <w:rFonts w:cstheme="minorHAnsi"/>
+              </w:rPr>
+              <w:t>}</w:t>
+            </w:r>
+            <w:r>
+              <w:rPr>
+                <w:rFonts w:cstheme="minorHAnsi"/>
+              </w:rPr>
+              <w:t>{/</w:t>
             </w:r>
             <w:proofErr w:type="spellStart"/>
             <w:r>
@@ -859,7 +893,7 @@
         <w:tblLook w:val="04A0" w:firstRow="1" w:lastRow="0" w:firstColumn="1" w:lastColumn="0" w:noHBand="0" w:noVBand="1"/>
       </w:tblPr>
       <w:tblGrid>
-        <w:gridCol w:w="1525"/>
+        <w:gridCol w:w="2645"/>
         <w:gridCol w:w="5130"/>
       </w:tblGrid>
       <w:tr>
@@ -971,6 +1005,30 @@
                 <w:b w:val="0"/>
                 <w:bCs w:val="0"/>
               </w:rPr>
+              <w:t>{</w:t>
+            </w:r>
+            <w:r>
+              <w:rPr>
+                <w:rFonts w:cstheme="minorHAnsi"/>
+                <w:b w:val="0"/>
+                <w:bCs w:val="0"/>
+              </w:rPr>
+              <w:t>#</w:t>
+            </w:r>
+            <w:r>
+              <w:rPr>
+                <w:rFonts w:cstheme="minorHAnsi"/>
+                <w:b w:val="0"/>
+                <w:bCs w:val="0"/>
+              </w:rPr>
+              <w:t>billToCompany}</w:t>
+            </w:r>
+            <w:r>
+              <w:rPr>
+                <w:rFonts w:cstheme="minorHAnsi"/>
+                <w:b w:val="0"/>
+                <w:bCs w:val="0"/>
+              </w:rPr>
               <w:t xml:space="preserve">Company ID: </w:t>
             </w:r>
             <w:r>
@@ -1007,6 +1065,32 @@
                 <w:rFonts w:cstheme="minorHAnsi"/>
               </w:rPr>
               <w:t>{</w:t>
+            </w:r>
+            <w:proofErr w:type="spellStart"/>
+            <w:r>
+              <w:rPr>
+                <w:rFonts w:cstheme="minorHAnsi"/>
+              </w:rPr>
+              <w:t>billToCompany</w:t>
+            </w:r>
+            <w:proofErr w:type="spellEnd"/>
+            <w:r>
+              <w:rPr>
+                <w:rFonts w:cstheme="minorHAnsi"/>
+              </w:rPr>
+              <w:t>}</w:t>
+            </w:r>
+            <w:r>
+              <w:rPr>
+                <w:rFonts w:cstheme="minorHAnsi"/>
+              </w:rPr>
+              <w:t>{</w:t>
+            </w:r>
+            <w:r>
+              <w:rPr>
+                <w:rFonts w:cstheme="minorHAnsi"/>
+              </w:rPr>
+              <w:t>/</w:t>
             </w:r>
             <w:proofErr w:type="spellStart"/>
             <w:r>
@@ -1054,6 +1138,36 @@
                 <w:b w:val="0"/>
                 <w:bCs w:val="0"/>
               </w:rPr>
+              <w:t>{</w:t>
+            </w:r>
+            <w:r>
+              <w:rPr>
+                <w:rFonts w:cstheme="minorHAnsi"/>
+                <w:b w:val="0"/>
+                <w:bCs w:val="0"/>
+              </w:rPr>
+              <w:t>#</w:t>
+            </w:r>
+            <w:r>
+              <w:rPr>
+                <w:rFonts w:cstheme="minorHAnsi"/>
+                <w:b w:val="0"/>
+                <w:bCs w:val="0"/>
+              </w:rPr>
+              <w:t>billToTaxId</w:t>
+            </w:r>
+            <w:r>
+              <w:rPr>
+                <w:rFonts w:cstheme="minorHAnsi"/>
+              </w:rPr>
+              <w:t>}</w:t>
+            </w:r>
+            <w:r>
+              <w:rPr>
+                <w:rFonts w:cstheme="minorHAnsi"/>
+                <w:b w:val="0"/>
+                <w:bCs w:val="0"/>
+              </w:rPr>
               <w:t xml:space="preserve">Tax </w:t>
             </w:r>
             <w:r>
@@ -1106,6 +1220,32 @@
                 <w:rFonts w:cstheme="minorHAnsi"/>
               </w:rPr>
               <w:t>{</w:t>
+            </w:r>
+            <w:proofErr w:type="spellStart"/>
+            <w:r>
+              <w:rPr>
+                <w:rFonts w:cstheme="minorHAnsi"/>
+              </w:rPr>
+              <w:t>billToTaxId</w:t>
+            </w:r>
+            <w:proofErr w:type="spellEnd"/>
+            <w:r>
+              <w:rPr>
+                <w:rFonts w:cstheme="minorHAnsi"/>
+              </w:rPr>
+              <w:t>}</w:t>
+            </w:r>
+            <w:r>
+              <w:rPr>
+                <w:rFonts w:cstheme="minorHAnsi"/>
+              </w:rPr>
+              <w:t>{</w:t>
+            </w:r>
+            <w:r>
+              <w:rPr>
+                <w:rFonts w:cstheme="minorHAnsi"/>
+              </w:rPr>
+              <w:t>/</w:t>
             </w:r>
             <w:proofErr w:type="spellStart"/>
             <w:r>
@@ -1237,23 +1377,29 @@
               </w:rPr>
               <w:t>{</w:t>
             </w:r>
-            <w:proofErr w:type="spellStart"/>
-            <w:r>
-              <w:rPr>
-                <w:rFonts w:cstheme="minorHAnsi"/>
-                <w:b w:val="0"/>
-                <w:bCs w:val="0"/>
-              </w:rPr>
-              <w:t>poLabel</w:t>
-            </w:r>
-            <w:proofErr w:type="spellEnd"/>
-            <w:r>
-              <w:rPr>
-                <w:rFonts w:cstheme="minorHAnsi"/>
-                <w:b w:val="0"/>
-                <w:bCs w:val="0"/>
-              </w:rPr>
-              <w:t>}</w:t>
+            <w:r>
+              <w:rPr>
+                <w:rFonts w:cstheme="minorHAnsi"/>
+                <w:b w:val="0"/>
+                <w:bCs w:val="0"/>
+              </w:rPr>
+              <w:t>#</w:t>
+            </w:r>
+            <w:r>
+              <w:rPr>
+                <w:rFonts w:cstheme="minorHAnsi"/>
+                <w:b w:val="0"/>
+                <w:bCs w:val="0"/>
+              </w:rPr>
+              <w:t>po}</w:t>
+            </w:r>
+            <w:r>
+              <w:rPr>
+                <w:rFonts w:cstheme="minorHAnsi"/>
+                <w:b w:val="0"/>
+                <w:bCs w:val="0"/>
+              </w:rPr>
+              <w:t>PO</w:t>
             </w:r>
           </w:p>
         </w:tc>
@@ -1281,6 +1427,12 @@
                 <w:rFonts w:cstheme="minorHAnsi"/>
               </w:rPr>
               <w:t>{po}</w:t>
+            </w:r>
+            <w:r>
+              <w:rPr>
+                <w:rFonts w:cstheme="minorHAnsi"/>
+              </w:rPr>
+              <w:t>{/po}</w:t>
             </w:r>
           </w:p>
         </w:tc>
@@ -1405,25 +1557,7 @@
                 <w:b w:val="0"/>
                 <w:bCs w:val="0"/>
               </w:rPr>
-              <w:t>{#</w:t>
-            </w:r>
-            <w:proofErr w:type="gramStart"/>
-            <w:r>
-              <w:rPr>
-                <w:rFonts w:cstheme="minorHAnsi"/>
-                <w:b w:val="0"/>
-                <w:bCs w:val="0"/>
-              </w:rPr>
-              <w:t>s}{</w:t>
-            </w:r>
-            <w:proofErr w:type="gramEnd"/>
-            <w:r>
-              <w:rPr>
-                <w:rFonts w:cstheme="minorHAnsi"/>
-                <w:b w:val="0"/>
-                <w:bCs w:val="0"/>
-              </w:rPr>
-              <w:t>description}</w:t>
+              <w:t>{#s}{description}</w:t>
             </w:r>
           </w:p>
         </w:tc>
@@ -1643,8 +1777,8 @@
         <w:tblLook w:val="04A0" w:firstRow="1" w:lastRow="0" w:firstColumn="1" w:lastColumn="0" w:noHBand="0" w:noVBand="1"/>
       </w:tblPr>
       <w:tblGrid>
-        <w:gridCol w:w="2245"/>
-        <w:gridCol w:w="7115"/>
+        <w:gridCol w:w="2546"/>
+        <w:gridCol w:w="6814"/>
       </w:tblGrid>
       <w:tr>
         <w:trPr>
@@ -1963,6 +2097,30 @@
                 <w:b w:val="0"/>
                 <w:bCs w:val="0"/>
               </w:rPr>
+              <w:t>{</w:t>
+            </w:r>
+            <w:r>
+              <w:rPr>
+                <w:rFonts w:cstheme="minorHAnsi"/>
+                <w:b w:val="0"/>
+                <w:bCs w:val="0"/>
+              </w:rPr>
+              <w:t>#</w:t>
+            </w:r>
+            <w:r>
+              <w:rPr>
+                <w:rFonts w:cstheme="minorHAnsi"/>
+                <w:b w:val="0"/>
+                <w:bCs w:val="0"/>
+              </w:rPr>
+              <w:t>swiftCode}</w:t>
+            </w:r>
+            <w:r>
+              <w:rPr>
+                <w:rFonts w:cstheme="minorHAnsi"/>
+                <w:b w:val="0"/>
+                <w:bCs w:val="0"/>
+              </w:rPr>
               <w:t>SWIFT code</w:t>
             </w:r>
             <w:r>
@@ -2000,6 +2158,26 @@
                 <w:rFonts w:cstheme="minorHAnsi"/>
               </w:rPr>
               <w:t>{</w:t>
+            </w:r>
+            <w:proofErr w:type="spellStart"/>
+            <w:r>
+              <w:rPr>
+                <w:rFonts w:cstheme="minorHAnsi"/>
+              </w:rPr>
+              <w:t>swiftCode</w:t>
+            </w:r>
+            <w:proofErr w:type="spellEnd"/>
+            <w:r>
+              <w:rPr>
+                <w:rFonts w:cstheme="minorHAnsi"/>
+              </w:rPr>
+              <w:t>}</w:t>
+            </w:r>
+            <w:r>
+              <w:rPr>
+                <w:rFonts w:cstheme="minorHAnsi"/>
+              </w:rPr>
+              <w:t>{/</w:t>
             </w:r>
             <w:proofErr w:type="spellStart"/>
             <w:r>
@@ -2048,23 +2226,7 @@
                 <w:b w:val="0"/>
                 <w:bCs w:val="0"/>
               </w:rPr>
-              <w:t>Routi</w:t>
-            </w:r>
-            <w:r>
-              <w:rPr>
-                <w:rFonts w:cstheme="minorHAnsi"/>
-                <w:b w:val="0"/>
-                <w:bCs w:val="0"/>
-              </w:rPr>
-              <w:t>ng number</w:t>
-            </w:r>
-            <w:r>
-              <w:rPr>
-                <w:rFonts w:cstheme="minorHAnsi"/>
-                <w:b w:val="0"/>
-                <w:bCs w:val="0"/>
-              </w:rPr>
-              <w:t>:</w:t>
+              <w:t>{#routingNumber}Routing number:</w:t>
             </w:r>
           </w:p>
         </w:tc>
@@ -2106,6 +2268,20 @@
               <w:rPr>
                 <w:rFonts w:cstheme="minorHAnsi"/>
               </w:rPr>
+              <w:t>}{/</w:t>
+            </w:r>
+            <w:proofErr w:type="spellStart"/>
+            <w:r>
+              <w:rPr>
+                <w:rFonts w:cstheme="minorHAnsi"/>
+              </w:rPr>
+              <w:t>routingNumber</w:t>
+            </w:r>
+            <w:proofErr w:type="spellEnd"/>
+            <w:r>
+              <w:rPr>
+                <w:rFonts w:cstheme="minorHAnsi"/>
+              </w:rPr>
               <w:t>}</w:t>
             </w:r>
           </w:p>
@@ -2138,6 +2314,30 @@
                 <w:b w:val="0"/>
                 <w:bCs w:val="0"/>
               </w:rPr>
+              <w:t>{</w:t>
+            </w:r>
+            <w:r>
+              <w:rPr>
+                <w:rFonts w:cstheme="minorHAnsi"/>
+                <w:b w:val="0"/>
+                <w:bCs w:val="0"/>
+              </w:rPr>
+              <w:t>#</w:t>
+            </w:r>
+            <w:r>
+              <w:rPr>
+                <w:rFonts w:cstheme="minorHAnsi"/>
+                <w:b w:val="0"/>
+                <w:bCs w:val="0"/>
+              </w:rPr>
+              <w:t>accountType}</w:t>
+            </w:r>
+            <w:r>
+              <w:rPr>
+                <w:rFonts w:cstheme="minorHAnsi"/>
+                <w:b w:val="0"/>
+                <w:bCs w:val="0"/>
+              </w:rPr>
               <w:t>Account type</w:t>
             </w:r>
             <w:r>
@@ -2175,6 +2375,26 @@
                 <w:rFonts w:cstheme="minorHAnsi"/>
               </w:rPr>
               <w:t>{</w:t>
+            </w:r>
+            <w:proofErr w:type="spellStart"/>
+            <w:r>
+              <w:rPr>
+                <w:rFonts w:cstheme="minorHAnsi"/>
+              </w:rPr>
+              <w:t>accountType</w:t>
+            </w:r>
+            <w:proofErr w:type="spellEnd"/>
+            <w:r>
+              <w:rPr>
+                <w:rFonts w:cstheme="minorHAnsi"/>
+              </w:rPr>
+              <w:t>}</w:t>
+            </w:r>
+            <w:r>
+              <w:rPr>
+                <w:rFonts w:cstheme="minorHAnsi"/>
+              </w:rPr>
+              <w:t>{/</w:t>
             </w:r>
             <w:proofErr w:type="spellStart"/>
             <w:r>
@@ -2223,6 +2443,30 @@
                 <w:b w:val="0"/>
                 <w:bCs w:val="0"/>
               </w:rPr>
+              <w:t>{</w:t>
+            </w:r>
+            <w:r>
+              <w:rPr>
+                <w:rFonts w:cstheme="minorHAnsi"/>
+                <w:b w:val="0"/>
+                <w:bCs w:val="0"/>
+              </w:rPr>
+              <w:t>#</w:t>
+            </w:r>
+            <w:r>
+              <w:rPr>
+                <w:rFonts w:cstheme="minorHAnsi"/>
+                <w:b w:val="0"/>
+                <w:bCs w:val="0"/>
+              </w:rPr>
+              <w:t>bankAddress}</w:t>
+            </w:r>
+            <w:r>
+              <w:rPr>
+                <w:rFonts w:cstheme="minorHAnsi"/>
+                <w:b w:val="0"/>
+                <w:bCs w:val="0"/>
+              </w:rPr>
               <w:t>Address</w:t>
             </w:r>
             <w:r>
@@ -2260,6 +2504,26 @@
                 <w:rFonts w:cstheme="minorHAnsi"/>
               </w:rPr>
               <w:t>{</w:t>
+            </w:r>
+            <w:proofErr w:type="spellStart"/>
+            <w:r>
+              <w:rPr>
+                <w:rFonts w:cstheme="minorHAnsi"/>
+              </w:rPr>
+              <w:t>bankAddress</w:t>
+            </w:r>
+            <w:proofErr w:type="spellEnd"/>
+            <w:r>
+              <w:rPr>
+                <w:rFonts w:cstheme="minorHAnsi"/>
+              </w:rPr>
+              <w:t>}</w:t>
+            </w:r>
+            <w:r>
+              <w:rPr>
+                <w:rFonts w:cstheme="minorHAnsi"/>
+              </w:rPr>
+              <w:t>{/</w:t>
             </w:r>
             <w:proofErr w:type="spellStart"/>
             <w:r>

</xml_diff>

<commit_message>
chore: not required email
</commit_message>
<xml_diff>
--- a/public/preview/template.docx
+++ b/public/preview/template.docx
@@ -52,10 +52,10 @@
         <w:tblLook w:val="04A0" w:firstRow="1" w:lastRow="0" w:firstColumn="1" w:lastColumn="0" w:noHBand="0" w:noVBand="1"/>
       </w:tblPr>
       <w:tblGrid>
-        <w:gridCol w:w="1530"/>
-        <w:gridCol w:w="5125"/>
-        <w:gridCol w:w="1080"/>
-        <w:gridCol w:w="2160"/>
+        <w:gridCol w:w="2175"/>
+        <w:gridCol w:w="4605"/>
+        <w:gridCol w:w="1057"/>
+        <w:gridCol w:w="2058"/>
       </w:tblGrid>
       <w:tr>
         <w:trPr>
@@ -578,6 +578,30 @@
                 <w:b w:val="0"/>
                 <w:bCs w:val="0"/>
               </w:rPr>
+              <w:t>{#</w:t>
+            </w:r>
+            <w:r>
+              <w:rPr>
+                <w:rFonts w:cstheme="minorHAnsi"/>
+                <w:b w:val="0"/>
+                <w:bCs w:val="0"/>
+              </w:rPr>
+              <w:t>partnerEmail</w:t>
+            </w:r>
+            <w:r>
+              <w:rPr>
+                <w:rFonts w:cstheme="minorHAnsi"/>
+                <w:b w:val="0"/>
+                <w:bCs w:val="0"/>
+              </w:rPr>
+              <w:t>}</w:t>
+            </w:r>
+            <w:r>
+              <w:rPr>
+                <w:rFonts w:cstheme="minorHAnsi"/>
+                <w:b w:val="0"/>
+                <w:bCs w:val="0"/>
+              </w:rPr>
               <w:t>Email</w:t>
             </w:r>
             <w:r>
@@ -616,6 +640,30 @@
                 <w:rFonts w:cstheme="minorHAnsi"/>
               </w:rPr>
               <w:t>{</w:t>
+            </w:r>
+            <w:r>
+              <w:rPr>
+                <w:rFonts w:cstheme="minorHAnsi"/>
+              </w:rPr>
+              <w:t>partnerEmail</w:t>
+            </w:r>
+            <w:r>
+              <w:rPr>
+                <w:rFonts w:cstheme="minorHAnsi"/>
+              </w:rPr>
+              <w:t>}</w:t>
+            </w:r>
+            <w:r>
+              <w:rPr>
+                <w:rFonts w:cstheme="minorHAnsi"/>
+              </w:rPr>
+              <w:t>{</w:t>
+            </w:r>
+            <w:r>
+              <w:rPr>
+                <w:rFonts w:cstheme="minorHAnsi"/>
+              </w:rPr>
+              <w:t>/</w:t>
             </w:r>
             <w:r>
               <w:rPr>
@@ -3006,7 +3054,6 @@
   <w:style w:type="character" w:default="1" w:styleId="DefaultParagraphFont">
     <w:name w:val="Default Paragraph Font"/>
     <w:uiPriority w:val="1"/>
-    <w:semiHidden/>
     <w:unhideWhenUsed/>
   </w:style>
   <w:style w:type="table" w:default="1" w:styleId="TableNormal">

</xml_diff>

<commit_message>
update: can change invoice ino, template update
</commit_message>
<xml_diff>
--- a/public/preview/template.docx
+++ b/public/preview/template.docx
@@ -1216,7 +1216,6 @@
               </w:rPr>
               <w:t>#</w:t>
             </w:r>
-            <w:proofErr w:type="gramStart"/>
             <w:r>
               <w:rPr>
                 <w:rFonts w:cstheme="minorHAnsi"/>
@@ -1237,16 +1236,7 @@
                 <w:b w:val="0"/>
                 <w:bCs w:val="0"/>
               </w:rPr>
-              <w:t>Tax</w:t>
-            </w:r>
-            <w:proofErr w:type="gramEnd"/>
-            <w:r>
-              <w:rPr>
-                <w:rFonts w:cstheme="minorHAnsi"/>
-                <w:b w:val="0"/>
-                <w:bCs w:val="0"/>
-              </w:rPr>
-              <w:t xml:space="preserve"> </w:t>
+              <w:t xml:space="preserve">Tax </w:t>
             </w:r>
             <w:r>
               <w:rPr>
@@ -1629,25 +1619,7 @@
                 <w:b w:val="0"/>
                 <w:bCs w:val="0"/>
               </w:rPr>
-              <w:t>{#</w:t>
-            </w:r>
-            <w:proofErr w:type="gramStart"/>
-            <w:r>
-              <w:rPr>
-                <w:rFonts w:cstheme="minorHAnsi"/>
-                <w:b w:val="0"/>
-                <w:bCs w:val="0"/>
-              </w:rPr>
-              <w:t>s}{</w:t>
-            </w:r>
-            <w:proofErr w:type="gramEnd"/>
-            <w:r>
-              <w:rPr>
-                <w:rFonts w:cstheme="minorHAnsi"/>
-                <w:b w:val="0"/>
-                <w:bCs w:val="0"/>
-              </w:rPr>
-              <w:t>description}</w:t>
+              <w:t>{#s}{description}</w:t>
             </w:r>
           </w:p>
         </w:tc>
@@ -2316,25 +2288,7 @@
                 <w:b w:val="0"/>
                 <w:bCs w:val="0"/>
               </w:rPr>
-              <w:t>{#</w:t>
-            </w:r>
-            <w:proofErr w:type="gramStart"/>
-            <w:r>
-              <w:rPr>
-                <w:rFonts w:cstheme="minorHAnsi"/>
-                <w:b w:val="0"/>
-                <w:bCs w:val="0"/>
-              </w:rPr>
-              <w:t>routingNumber}Routing</w:t>
-            </w:r>
-            <w:proofErr w:type="gramEnd"/>
-            <w:r>
-              <w:rPr>
-                <w:rFonts w:cstheme="minorHAnsi"/>
-                <w:b w:val="0"/>
-                <w:bCs w:val="0"/>
-              </w:rPr>
-              <w:t xml:space="preserve"> number:</w:t>
+              <w:t>{#routingNumber}Routing number:</w:t>
             </w:r>
           </w:p>
         </w:tc>
@@ -2432,7 +2386,6 @@
               </w:rPr>
               <w:t>#</w:t>
             </w:r>
-            <w:proofErr w:type="gramStart"/>
             <w:r>
               <w:rPr>
                 <w:rFonts w:cstheme="minorHAnsi"/>
@@ -2447,16 +2400,7 @@
                 <w:b w:val="0"/>
                 <w:bCs w:val="0"/>
               </w:rPr>
-              <w:t>Account</w:t>
-            </w:r>
-            <w:proofErr w:type="gramEnd"/>
-            <w:r>
-              <w:rPr>
-                <w:rFonts w:cstheme="minorHAnsi"/>
-                <w:b w:val="0"/>
-                <w:bCs w:val="0"/>
-              </w:rPr>
-              <w:t xml:space="preserve"> type</w:t>
+              <w:t>Account type</w:t>
             </w:r>
             <w:r>
               <w:rPr>
@@ -2571,7 +2515,6 @@
               </w:rPr>
               <w:t>#</w:t>
             </w:r>
-            <w:proofErr w:type="gramStart"/>
             <w:r>
               <w:rPr>
                 <w:rFonts w:cstheme="minorHAnsi"/>
@@ -2588,7 +2531,6 @@
               </w:rPr>
               <w:t>Address</w:t>
             </w:r>
-            <w:proofErr w:type="gramEnd"/>
             <w:r>
               <w:rPr>
                 <w:rFonts w:cstheme="minorHAnsi"/>
@@ -2713,6 +2655,7 @@
           </w:tcPr>
           <w:p>
             <w:pPr>
+              <w:spacing w:line="360" w:lineRule="auto"/>
               <w:jc w:val="center"/>
               <w:rPr>
                 <w:rFonts w:eastAsia="Times New Roman" w:cstheme="minorHAnsi"/>
@@ -2755,6 +2698,7 @@
           </w:tcPr>
           <w:p>
             <w:pPr>
+              <w:spacing w:line="360" w:lineRule="auto"/>
               <w:jc w:val="center"/>
               <w:rPr>
                 <w:rFonts w:eastAsia="Times New Roman" w:cstheme="minorHAnsi"/>
@@ -2811,6 +2755,7 @@
           </w:tcPr>
           <w:p>
             <w:pPr>
+              <w:spacing w:line="360" w:lineRule="auto"/>
               <w:jc w:val="center"/>
               <w:rPr>
                 <w:rFonts w:eastAsia="Times New Roman" w:cstheme="minorHAnsi"/>

</xml_diff>